<commit_message>
Match Excel columns to Archicad schedule exactly
- schedule_columns.json now mirrors the Archicad schedule fields:
  Quantity, TEAR SHEET #, Location, Element Type, Library Part Name,
  Layer, EID Classification, Archicad Classification, MasterFormat,
  OmniClass, UniFormat, Uniformat
- New source types: classification:SystemName (fetches from Archicad
  classification systems), literal:value (static values like Qty=1)
- Removed all hardcoded MANUFACTURER/MODEL#/SIZE/FINISH columns
- Classification data fetched via GetClassificationsOfElements API
  and resolved to "id - name" format from classification trees
- EBIF UID always prepended as first locked column

Co-Authored-By: Claude Opus 4.6 (1M context) <noreply@anthropic.com>
</commit_message>
<xml_diff>
--- a/EBIF-CALC_Architecture.docx
+++ b/EBIF-CALC_Architecture.docx
@@ -7949,7 +7949,177 @@
           <w:sz w:val="32"/>
           <w:szCs w:val="32"/>
         </w:rPr>
-        <w:t xml:space="preserve">12. Troubleshooting</w:t>
+        <w:t xml:space="preserve">⚠️ 12. Schedule Column Configuration</w:t>
+      </w:r>
+    </w:p>
+    <w:p>
+      <w:pPr>
+        <w:spacing w:after="120"/>
+      </w:pPr>
+      <w:r>
+        <w:rPr>
+          <w:rFonts w:ascii="Arial Narrow" w:cs="Arial Narrow" w:eastAsia="Arial Narrow" w:hAnsi="Arial Narrow"/>
+          <w:color w:val="2C2C2C"/>
+          <w:sz w:val="22"/>
+          <w:szCs w:val="22"/>
+        </w:rPr>
+        <w:t xml:space="preserve">The columns that appear in each Excel schedule file are defined in a single configuration file. This is the one place you edit when you need to add, remove, or reorder columns for any schedule category.</w:t>
+      </w:r>
+    </w:p>
+    <w:p>
+      <w:pPr>
+        <w:spacing w:after="60" w:before="200"/>
+      </w:pPr>
+      <w:r>
+        <w:rPr>
+          <w:rFonts w:ascii="Lato" w:cs="Lato" w:eastAsia="Lato" w:hAnsi="Lato"/>
+          <w:b/>
+          <w:bCs/>
+          <w:color w:val="868C54"/>
+          <w:sz w:val="24"/>
+          <w:szCs w:val="24"/>
+        </w:rPr>
+        <w:t xml:space="preserve">File Location</w:t>
+      </w:r>
+    </w:p>
+    <w:p>
+      <w:pPr>
+        <w:spacing w:after="120"/>
+      </w:pPr>
+      <w:r>
+        <w:rPr>
+          <w:rFonts w:ascii="Consolas" w:cs="Consolas" w:eastAsia="Consolas" w:hAnsi="Consolas"/>
+          <w:color w:val="2C2C2C"/>
+          <w:sz w:val="20"/>
+          <w:szCs w:val="20"/>
+        </w:rPr>
+        <w:t xml:space="preserve">EBIF-CALC/config/schedule_columns.json</w:t>
+      </w:r>
+    </w:p>
+    <w:p>
+      <w:pPr>
+        <w:spacing w:after="60" w:before="200"/>
+      </w:pPr>
+      <w:r>
+        <w:rPr>
+          <w:rFonts w:ascii="Lato" w:cs="Lato" w:eastAsia="Lato" w:hAnsi="Lato"/>
+          <w:b/>
+          <w:bCs/>
+          <w:color w:val="868C54"/>
+          <w:sz w:val="24"/>
+          <w:szCs w:val="24"/>
+        </w:rPr>
+        <w:t xml:space="preserve">How It Works</w:t>
+      </w:r>
+    </w:p>
+    <w:p>
+      <w:pPr>
+        <w:spacing w:after="120"/>
+      </w:pPr>
+      <w:r>
+        <w:rPr>
+          <w:rFonts w:ascii="Arial Narrow" w:cs="Arial Narrow" w:eastAsia="Arial Narrow" w:hAnsi="Arial Narrow"/>
+          <w:color w:val="2C2C2C"/>
+          <w:sz w:val="22"/>
+          <w:szCs w:val="22"/>
+        </w:rPr>
+        <w:t xml:space="preserve">Each schedule category has a list of columns. Each column has a label (the Excel header name) and a source that tells the pipeline where to get the data. There are two source types:</w:t>
+      </w:r>
+    </w:p>
+    <w:p>
+      <w:pPr>
+        <w:spacing w:after="80"/>
+      </w:pPr>
+      <w:r>
+        <w:rPr>
+          <w:rFonts w:ascii="Arial Narrow" w:cs="Arial Narrow" w:eastAsia="Arial Narrow" w:hAnsi="Arial Narrow"/>
+          <w:color w:val="2C2C2C"/>
+          <w:sz w:val="22"/>
+          <w:szCs w:val="22"/>
+        </w:rPr>
+        <w:t xml:space="preserve">•  builtin:PropertyName — Archicad built-in property (Name, Zone, Layer, Element Type, Library Part Name)</w:t>
+      </w:r>
+    </w:p>
+    <w:p>
+      <w:pPr>
+        <w:spacing w:after="80"/>
+      </w:pPr>
+      <w:r>
+        <w:rPr>
+          <w:rFonts w:ascii="Arial Narrow" w:cs="Arial Narrow" w:eastAsia="Arial Narrow" w:hAnsi="Arial Narrow"/>
+          <w:color w:val="2C2C2C"/>
+          <w:sz w:val="22"/>
+          <w:szCs w:val="22"/>
+        </w:rPr>
+        <w:t xml:space="preserve">•  user:PropertyName — User-defined EBIF property (TEAR SHEET #, MANUFACTURER, FINISH, COST, etc.)</w:t>
+      </w:r>
+    </w:p>
+    <w:p>
+      <w:pPr>
+        <w:spacing w:after="120"/>
+      </w:pPr>
+      <w:r>
+        <w:rPr>
+          <w:rFonts w:ascii="Arial Narrow" w:cs="Arial Narrow" w:eastAsia="Arial Narrow" w:hAnsi="Arial Narrow"/>
+          <w:color w:val="2C2C2C"/>
+          <w:sz w:val="22"/>
+          <w:szCs w:val="22"/>
+        </w:rPr>
+        <w:t xml:space="preserve">EBIF UID is always added automatically as the first column. If a schedule points to “_default_columns”, it uses the shared default list. Otherwise it has its own custom column list.</w:t>
+      </w:r>
+    </w:p>
+    <w:p>
+      <w:pPr>
+        <w:spacing w:after="60" w:before="200"/>
+      </w:pPr>
+      <w:r>
+        <w:rPr>
+          <w:rFonts w:ascii="Lato" w:cs="Lato" w:eastAsia="Lato" w:hAnsi="Lato"/>
+          <w:b/>
+          <w:bCs/>
+          <w:color w:val="868C54"/>
+          <w:sz w:val="24"/>
+          <w:szCs w:val="24"/>
+        </w:rPr>
+        <w:t xml:space="preserve">When to Edit</w:t>
+      </w:r>
+    </w:p>
+    <w:p>
+      <w:pPr>
+        <w:spacing w:after="120"/>
+      </w:pPr>
+      <w:r>
+        <w:rPr>
+          <w:rFonts w:ascii="Arial Narrow" w:cs="Arial Narrow" w:eastAsia="Arial Narrow" w:hAnsi="Arial Narrow"/>
+          <w:color w:val="2C2C2C"/>
+          <w:sz w:val="22"/>
+          <w:szCs w:val="22"/>
+        </w:rPr>
+        <w:t xml:space="preserve">Edit this file when you change the Archicad schedule scheme — for example, if you add a new field to the Appliances schedule in Archicad, add a matching column entry here so it appears in the Excel output. The pipeline does not read the Archicad schedule scheme directly; this file is the single source of truth for Excel columns.</w:t>
+      </w:r>
+    </w:p>
+    <w:p>
+      <w:pPr>
+        <w:pBdr>
+          <w:bottom w:val="single" w:color="C2C8A2" w:sz="6" w:space="1"/>
+        </w:pBdr>
+        <w:spacing w:after="200" w:before="200"/>
+      </w:pPr>
+    </w:p>
+    <w:p>
+      <w:pPr>
+        <w:spacing w:after="200" w:before="400"/>
+      </w:pPr>
+      <w:r>
+        <w:rPr>
+          <w:rFonts w:ascii="Lato" w:cs="Lato" w:eastAsia="Lato" w:hAnsi="Lato"/>
+          <w:b/>
+          <w:bCs/>
+          <w:color w:val="868C54"/>
+          <w:sz w:val="32"/>
+          <w:szCs w:val="32"/>
+        </w:rPr>
+        <w:t xml:space="preserve">13. Troubleshooting</w:t>
       </w:r>
     </w:p>
     <w:tbl>

</xml_diff>